<commit_message>
Update installer onboarding template
Co-Authored-By: Claude Sonnet 4.5 <noreply@anthropic.com>
</commit_message>
<xml_diff>
--- a/templates/Installer_Onboarding_Template.docx
+++ b/templates/Installer_Onboarding_Template.docx
@@ -4,22 +4,7 @@
   <w:body>
     <w:p>
       <w:pPr>
-        <w:spacing w:line="259" w:lineRule="auto"/>
-        <w:rPr>
-          <w:color w:val="222222"/>
-          <w:sz w:val="24"/>
-          <w:szCs w:val="24"/>
-        </w:rPr>
-      </w:pPr>
-      <w:r>
-        <w:t>{{GREETING}}</w:t>
-      </w:r>
-    </w:p>
-    <w:p>
-      <w:pPr>
-        <w:shd w:val="clear" w:color="auto" w:fill="FFFFFF"/>
-        <w:spacing w:line="249" w:lineRule="auto"/>
-        <w:ind w:left="10"/>
+        <w:pStyle w:val="AODTitle"/>
         <w:rPr>
           <w:sz w:val="24"/>
           <w:szCs w:val="24"/>
@@ -27,650 +12,343 @@
       </w:pPr>
       <w:r>
         <w:rPr>
-          <w:color w:val="222222"/>
           <w:sz w:val="24"/>
           <w:szCs w:val="24"/>
         </w:rPr>
-        <w:t>Welcome to the Art of Drawers team! We are excited you're joining us. We've started your onboarding process by setting you up in the following systems. </w:t>
+        <w:t>{{GREETING}}</w:t>
+      </w:r>
+    </w:p>
+    <w:p>
+      <w:pPr>
+        <w:pStyle w:val="AODBody"/>
+      </w:pPr>
+      <w:r>
+        <w:t>Welcome to Art of Drawers! Please complete the required steps below to ensure you are fully prepared for Installer Training.</w:t>
+      </w:r>
+    </w:p>
+    <w:p>
+      <w:pPr>
+        <w:pStyle w:val="AODHeading"/>
+      </w:pPr>
+      <w:r>
+        <w:t>REQUIRED FIRST: Pre-Installer Training Modules</w:t>
+      </w:r>
+    </w:p>
+    <w:p>
+      <w:pPr>
+        <w:pStyle w:val="AODBody"/>
+      </w:pPr>
+      <w:r>
+        <w:t xml:space="preserve">Before attending Installer Training, you must complete </w:t>
+      </w:r>
+      <w:r>
+        <w:t>your</w:t>
+      </w:r>
+      <w:r>
+        <w:t xml:space="preserve"> </w:t>
       </w:r>
       <w:r>
         <w:rPr>
-          <w:sz w:val="24"/>
-          <w:szCs w:val="24"/>
+          <w:b/>
+          <w:bCs/>
+        </w:rPr>
+        <w:t>Pre-Installer Training modules</w:t>
+      </w:r>
+      <w:r>
+        <w:t>.</w:t>
+      </w:r>
+      <w:r>
+        <w:t xml:space="preserve"> </w:t>
+      </w:r>
+      <w:r>
+        <w:t>These modules will prepare you for training and walk you through all required Art of Drawers systems.</w:t>
+      </w:r>
+      <w:r>
+        <w:t xml:space="preserve"> </w:t>
+      </w:r>
+    </w:p>
+    <w:p>
+      <w:pPr>
+        <w:pStyle w:val="AODBody"/>
+      </w:pPr>
+      <w:r>
+        <w:t xml:space="preserve">How to Access </w:t>
+      </w:r>
+      <w:r>
+        <w:t>your</w:t>
+      </w:r>
+      <w:r>
+        <w:t xml:space="preserve"> </w:t>
+      </w:r>
+      <w:r>
+        <w:rPr>
+          <w:b/>
+          <w:bCs/>
+        </w:rPr>
+        <w:t>Pre-Installer Training modules</w:t>
+      </w:r>
+      <w:r>
+        <w:rPr>
+          <w:b/>
+          <w:bCs/>
+        </w:rPr>
+        <w:t>:</w:t>
+      </w:r>
+    </w:p>
+    <w:p>
+      <w:pPr>
+        <w:pStyle w:val="AODBody"/>
+        <w:numPr>
+          <w:ilvl w:val="0"/>
+          <w:numId w:val="2"/>
+        </w:numPr>
+        <w:spacing w:after="120" w:line="240" w:lineRule="auto"/>
+      </w:pPr>
+      <w:r>
+        <w:t xml:space="preserve">Click </w:t>
+      </w:r>
+      <w:hyperlink r:id="rId7" w:history="1">
+        <w:r>
+          <w:rPr>
+            <w:rStyle w:val="Hyperlink"/>
+          </w:rPr>
+          <w:t>HERE</w:t>
+        </w:r>
+      </w:hyperlink>
+    </w:p>
+    <w:p>
+      <w:pPr>
+        <w:pStyle w:val="AODBody"/>
+        <w:numPr>
+          <w:ilvl w:val="0"/>
+          <w:numId w:val="2"/>
+        </w:numPr>
+        <w:spacing w:after="120" w:line="240" w:lineRule="auto"/>
+      </w:pPr>
+      <w:r>
+        <w:t>Select Register for eLearning</w:t>
+      </w:r>
+    </w:p>
+    <w:p>
+      <w:pPr>
+        <w:pStyle w:val="AODBody"/>
+        <w:numPr>
+          <w:ilvl w:val="0"/>
+          <w:numId w:val="2"/>
+        </w:numPr>
+        <w:spacing w:after="120" w:line="240" w:lineRule="auto"/>
+      </w:pPr>
+      <w:r>
+        <w:t>Create your account</w:t>
+      </w:r>
+    </w:p>
+    <w:p>
+      <w:pPr>
+        <w:pStyle w:val="AODBody"/>
+        <w:numPr>
+          <w:ilvl w:val="0"/>
+          <w:numId w:val="2"/>
+        </w:numPr>
+        <w:spacing w:after="120" w:line="240" w:lineRule="auto"/>
+      </w:pPr>
+      <w:r>
+        <w:t>Log in and go to My eLearning</w:t>
+      </w:r>
+    </w:p>
+    <w:p>
+      <w:pPr>
+        <w:pStyle w:val="AODBody"/>
+        <w:numPr>
+          <w:ilvl w:val="0"/>
+          <w:numId w:val="2"/>
+        </w:numPr>
+        <w:spacing w:after="120" w:line="240" w:lineRule="auto"/>
+      </w:pPr>
+      <w:r>
+        <w:t>Complete all assigned modules</w:t>
+      </w:r>
+    </w:p>
+    <w:p>
+      <w:pPr>
+        <w:pStyle w:val="AODBody"/>
+        <w:spacing w:after="120" w:line="240" w:lineRule="auto"/>
+      </w:pPr>
+    </w:p>
+    <w:p>
+      <w:pPr>
+        <w:pStyle w:val="AODBody"/>
+        <w:spacing w:line="240" w:lineRule="auto"/>
+        <w:rPr>
+          <w:b/>
+          <w:bCs/>
+          <w:color w:val="EE0000"/>
+        </w:rPr>
+      </w:pPr>
+      <w:r>
+        <w:rPr>
+          <w:b/>
+          <w:bCs/>
+          <w:color w:val="EE0000"/>
+        </w:rPr>
+        <w:t>All modules must be completed before Installer Training.</w:t>
+      </w:r>
+      <w:r>
+        <w:rPr>
+          <w:b/>
+          <w:bCs/>
+          <w:color w:val="EE0000"/>
         </w:rPr>
         <w:t xml:space="preserve"> </w:t>
       </w:r>
-    </w:p>
-    <w:p>
-      <w:pPr>
-        <w:shd w:val="clear" w:color="auto" w:fill="FFFFFF"/>
-        <w:spacing w:line="249" w:lineRule="auto"/>
-        <w:ind w:left="10"/>
-        <w:rPr>
-          <w:sz w:val="24"/>
-          <w:szCs w:val="24"/>
-        </w:rPr>
-      </w:pPr>
-    </w:p>
-    <w:p>
-      <w:pPr>
-        <w:shd w:val="clear" w:color="auto" w:fill="FFFFFF"/>
-        <w:spacing w:line="249" w:lineRule="auto"/>
-        <w:ind w:left="10"/>
+      <w:r>
+        <w:t>A training itinerary and additional instructions will be emailed one week prior to training.</w:t>
+      </w:r>
+    </w:p>
+    <w:p>
+      <w:pPr>
+        <w:pStyle w:val="AODHeading"/>
+      </w:pPr>
+      <w:r>
+        <w:t>Systems Covered in the Training Modules</w:t>
+      </w:r>
+    </w:p>
+    <w:p>
+      <w:pPr>
+        <w:pStyle w:val="AODBody"/>
+      </w:pPr>
+      <w:r>
+        <w:t xml:space="preserve">The systems below are fully explained during the training modules. Please </w:t>
+      </w:r>
+      <w:r>
+        <w:t xml:space="preserve">use the information to below to </w:t>
+      </w:r>
+      <w:r>
+        <w:t>ensure you can access each one.</w:t>
+      </w:r>
+    </w:p>
+    <w:p>
+      <w:pPr>
+        <w:pStyle w:val="AODBody"/>
+      </w:pPr>
+      <w:r>
         <w:rPr>
           <w:b/>
-          <w:sz w:val="24"/>
-          <w:szCs w:val="24"/>
+          <w:bCs/>
         </w:rPr>
+        <w:t>Gmail</w:t>
+      </w:r>
+      <w:r>
+        <w:br/>
+        <w:t>Email: {{GMAIL}}</w:t>
+      </w:r>
+      <w:r>
+        <w:br/>
+        <w:t>Password: 1429Lucile</w:t>
+      </w:r>
+    </w:p>
+    <w:p>
+      <w:pPr>
+        <w:pStyle w:val="AODBody"/>
       </w:pPr>
       <w:r>
         <w:rPr>
           <w:b/>
-          <w:sz w:val="24"/>
-          <w:szCs w:val="24"/>
+          <w:bCs/>
         </w:rPr>
-        <w:t>Gmail</w:t>
-      </w:r>
-    </w:p>
-    <w:p>
-      <w:pPr>
-        <w:shd w:val="clear" w:color="auto" w:fill="FFFFFF"/>
-        <w:spacing w:line="249" w:lineRule="auto"/>
-        <w:ind w:left="10"/>
-        <w:rPr>
-          <w:sz w:val="24"/>
-          <w:szCs w:val="24"/>
-        </w:rPr>
-      </w:pPr>
-      <w:hyperlink r:id="rId6">
-        <w:r>
-          <w:rPr>
-            <w:color w:val="1155CC"/>
-            <w:sz w:val="24"/>
-            <w:szCs w:val="24"/>
-            <w:u w:val="single"/>
-          </w:rPr>
-          <w:t>gmail.com</w:t>
-        </w:r>
-      </w:hyperlink>
-    </w:p>
-    <w:p>
-      <w:pPr>
-        <w:shd w:val="clear" w:color="auto" w:fill="FFFFFF"/>
-        <w:spacing w:line="249" w:lineRule="auto"/>
-        <w:ind w:left="10"/>
-        <w:rPr>
-          <w:sz w:val="24"/>
-          <w:szCs w:val="24"/>
-        </w:rPr>
-      </w:pPr>
-      <w:r>
-        <w:rPr>
-          <w:sz w:val="24"/>
-          <w:szCs w:val="24"/>
-        </w:rPr>
-        <w:t>Email</w:t>
-      </w:r>
-      <w:r>
-        <w:rPr>
-          <w:sz w:val="24"/>
-          <w:szCs w:val="24"/>
-        </w:rPr>
-        <w:t xml:space="preserve">: </w:t>
-      </w:r>
-      <w:r>
-        <w:t>{{GMAIL}}</w:t>
-      </w:r>
-    </w:p>
-    <w:p>
-      <w:pPr>
-        <w:shd w:val="clear" w:color="auto" w:fill="FFFFFF"/>
-        <w:spacing w:line="249" w:lineRule="auto"/>
-        <w:ind w:left="10"/>
-        <w:rPr>
-          <w:sz w:val="24"/>
-          <w:szCs w:val="24"/>
-        </w:rPr>
-      </w:pPr>
-      <w:r>
-        <w:rPr>
-          <w:sz w:val="24"/>
-          <w:szCs w:val="24"/>
-        </w:rPr>
-        <w:t>Password:</w:t>
-      </w:r>
-      <w:r>
-        <w:t xml:space="preserve"> </w:t>
-      </w:r>
-      <w:r>
-        <w:rPr>
-          <w:sz w:val="24"/>
-          <w:szCs w:val="24"/>
-        </w:rPr>
-        <w:t>1429Lucile</w:t>
-      </w:r>
-    </w:p>
-    <w:p>
-      <w:pPr>
-        <w:shd w:val="clear" w:color="auto" w:fill="FFFFFF"/>
-        <w:spacing w:line="249" w:lineRule="auto"/>
-        <w:rPr>
-          <w:sz w:val="24"/>
-          <w:szCs w:val="24"/>
-        </w:rPr>
-      </w:pPr>
-    </w:p>
-    <w:p>
-      <w:pPr>
-        <w:shd w:val="clear" w:color="auto" w:fill="FFFFFF"/>
-        <w:spacing w:line="249" w:lineRule="auto"/>
-        <w:ind w:left="10"/>
+        <w:t>Slack</w:t>
+      </w:r>
+      <w:r>
+        <w:br/>
+        <w:t>You will receive an invitation to the Art of Drawers Market Slack workspace in your Art of Drawers Gmail inbox.</w:t>
+      </w:r>
+      <w:r>
+        <w:t xml:space="preserve"> Please j</w:t>
+      </w:r>
+      <w:r>
+        <w:t>oin Art of Drawers Markets only.</w:t>
+      </w:r>
+    </w:p>
+    <w:p>
+      <w:pPr>
+        <w:pStyle w:val="AODBody"/>
         <w:rPr>
           <w:b/>
-          <w:sz w:val="24"/>
-          <w:szCs w:val="24"/>
+          <w:bCs/>
+          <w:color w:val="EE0000"/>
         </w:rPr>
       </w:pPr>
       <w:r>
         <w:rPr>
           <w:b/>
-          <w:sz w:val="24"/>
-          <w:szCs w:val="24"/>
+          <w:bCs/>
         </w:rPr>
-        <w:t>Slack</w:t>
-      </w:r>
-    </w:p>
-    <w:p>
-      <w:pPr>
-        <w:shd w:val="clear" w:color="auto" w:fill="FFFFFF"/>
-        <w:spacing w:line="249" w:lineRule="auto"/>
-        <w:ind w:left="10"/>
-        <w:rPr>
-          <w:color w:val="FF0000"/>
-          <w:sz w:val="24"/>
-          <w:szCs w:val="24"/>
-        </w:rPr>
-      </w:pPr>
-      <w:r>
-        <w:rPr>
-          <w:sz w:val="24"/>
-          <w:szCs w:val="24"/>
-        </w:rPr>
-        <w:t xml:space="preserve">An invitation to the Art of Drawers Market Slack workspace can be found in your Art of Drawers inbox. Accept the invitation to access our primary and preferred form of communication. </w:t>
-      </w:r>
-      <w:r>
-        <w:rPr>
-          <w:color w:val="FF0000"/>
-          <w:sz w:val="24"/>
-          <w:szCs w:val="24"/>
-        </w:rPr>
-        <w:t xml:space="preserve">Please join the Art of Drawers </w:t>
-      </w:r>
-      <w:r>
+        <w:t>Canvas</w:t>
+      </w:r>
+      <w:r>
+        <w:br/>
+        <w:t>https://canvas.artofdrawers.com</w:t>
+      </w:r>
+      <w:r>
+        <w:br/>
+        <w:t>Username: {{CANVAS_USERNAME}}</w:t>
+      </w:r>
+      <w:r>
+        <w:br/>
+        <w:t>Password: AOD</w:t>
+      </w:r>
+    </w:p>
+    <w:p>
+      <w:pPr>
+        <w:pStyle w:val="AODBody"/>
         <w:rPr>
           <w:b/>
-          <w:color w:val="FF0000"/>
-          <w:sz w:val="24"/>
-          <w:szCs w:val="24"/>
+          <w:bCs/>
         </w:rPr>
-        <w:t>Markets</w:t>
-      </w:r>
-      <w:r>
-        <w:rPr>
-          <w:color w:val="FF0000"/>
-          <w:sz w:val="24"/>
-          <w:szCs w:val="24"/>
-        </w:rPr>
-        <w:t xml:space="preserve"> Slack workspace only. </w:t>
-      </w:r>
-    </w:p>
-    <w:p>
-      <w:pPr>
-        <w:shd w:val="clear" w:color="auto" w:fill="FFFFFF"/>
-        <w:spacing w:line="249" w:lineRule="auto"/>
-        <w:ind w:left="10"/>
-        <w:rPr>
-          <w:sz w:val="24"/>
-          <w:szCs w:val="24"/>
-        </w:rPr>
-      </w:pPr>
-    </w:p>
-    <w:p>
-      <w:pPr>
-        <w:shd w:val="clear" w:color="auto" w:fill="FFFFFF"/>
-        <w:spacing w:line="249" w:lineRule="auto"/>
+      </w:pPr>
+      <w:r>
         <w:rPr>
           <w:b/>
-          <w:sz w:val="24"/>
-          <w:szCs w:val="24"/>
+          <w:bCs/>
+          <w:color w:val="EE0000"/>
         </w:rPr>
-      </w:pPr>
+        <w:t xml:space="preserve">Access </w:t>
+      </w:r>
       <w:r>
         <w:rPr>
           <w:b/>
-          <w:sz w:val="24"/>
-          <w:szCs w:val="24"/>
+          <w:bCs/>
+          <w:color w:val="EE0000"/>
         </w:rPr>
-        <w:t>Canvas</w:t>
-      </w:r>
-    </w:p>
-    <w:p>
-      <w:pPr>
-        <w:shd w:val="clear" w:color="auto" w:fill="FFFFFF"/>
-        <w:spacing w:line="249" w:lineRule="auto"/>
-        <w:rPr>
-          <w:sz w:val="24"/>
-          <w:szCs w:val="24"/>
-        </w:rPr>
-      </w:pPr>
-      <w:hyperlink r:id="rId7">
-        <w:r>
-          <w:rPr>
-            <w:color w:val="1155CC"/>
-            <w:sz w:val="24"/>
-            <w:szCs w:val="24"/>
-            <w:u w:val="single"/>
-          </w:rPr>
-          <w:t>canvas.artofdrawers.com</w:t>
-        </w:r>
-      </w:hyperlink>
-      <w:r>
-        <w:rPr>
-          <w:sz w:val="24"/>
-          <w:szCs w:val="24"/>
-        </w:rPr>
-        <w:tab/>
-      </w:r>
-      <w:r>
-        <w:rPr>
-          <w:sz w:val="24"/>
-          <w:szCs w:val="24"/>
-        </w:rPr>
-        <w:tab/>
-      </w:r>
-    </w:p>
-    <w:p>
-      <w:pPr>
-        <w:shd w:val="clear" w:color="auto" w:fill="FFFFFF"/>
-        <w:spacing w:line="249" w:lineRule="auto"/>
-        <w:rPr>
-          <w:sz w:val="24"/>
-          <w:szCs w:val="24"/>
-        </w:rPr>
-      </w:pPr>
-      <w:r>
-        <w:rPr>
-          <w:sz w:val="24"/>
-          <w:szCs w:val="24"/>
-        </w:rPr>
-        <w:t>Username</w:t>
-      </w:r>
-      <w:r>
-        <w:rPr>
-          <w:sz w:val="24"/>
-          <w:szCs w:val="24"/>
-        </w:rPr>
-        <w:t>:</w:t>
-      </w:r>
-      <w:r>
-        <w:rPr>
-          <w:sz w:val="24"/>
-          <w:szCs w:val="24"/>
-        </w:rPr>
-        <w:t xml:space="preserve"> </w:t>
-      </w:r>
-      <w:r>
-        <w:t>{{CANVAS_USERNAME}}</w:t>
-      </w:r>
-    </w:p>
-    <w:p>
-      <w:pPr>
-        <w:shd w:val="clear" w:color="auto" w:fill="FFFFFF"/>
-        <w:spacing w:line="249" w:lineRule="auto"/>
-        <w:rPr>
-          <w:sz w:val="24"/>
-          <w:szCs w:val="24"/>
-        </w:rPr>
-      </w:pPr>
-      <w:r>
-        <w:rPr>
-          <w:sz w:val="24"/>
-          <w:szCs w:val="24"/>
-        </w:rPr>
-        <w:t>Password: AOD</w:t>
-      </w:r>
-    </w:p>
-    <w:p>
-      <w:pPr>
-        <w:shd w:val="clear" w:color="auto" w:fill="FFFFFF"/>
-        <w:spacing w:line="249" w:lineRule="auto"/>
-        <w:rPr>
-          <w:color w:val="FF0000"/>
-          <w:sz w:val="24"/>
-          <w:szCs w:val="24"/>
-        </w:rPr>
-      </w:pPr>
-      <w:r>
-        <w:rPr>
-          <w:color w:val="FF0000"/>
-          <w:sz w:val="24"/>
-          <w:szCs w:val="24"/>
-        </w:rPr>
-        <w:t>Use letters and numbers ONLY when setting your unique Canvas password. The account will have to be reset if symbols are used.</w:t>
-      </w:r>
-    </w:p>
-    <w:p>
-      <w:pPr>
-        <w:shd w:val="clear" w:color="auto" w:fill="FFFFFF"/>
-        <w:spacing w:line="249" w:lineRule="auto"/>
-        <w:rPr>
-          <w:sz w:val="24"/>
-          <w:szCs w:val="24"/>
-        </w:rPr>
-      </w:pPr>
-    </w:p>
-    <w:p>
-      <w:pPr>
-        <w:shd w:val="clear" w:color="auto" w:fill="FFFFFF"/>
-        <w:spacing w:line="249" w:lineRule="auto"/>
+        <w:t>to each of these systems is only</w:t>
+      </w:r>
+      <w:r>
         <w:rPr>
           <w:b/>
-          <w:sz w:val="24"/>
-          <w:szCs w:val="24"/>
+          <w:bCs/>
+          <w:color w:val="EE0000"/>
         </w:rPr>
-      </w:pPr>
-      <w:r>
-        <w:rPr>
-          <w:b/>
-          <w:sz w:val="24"/>
-          <w:szCs w:val="24"/>
-        </w:rPr>
-        <w:t>Canvas Training Tab and Help Page</w:t>
-      </w:r>
-    </w:p>
-    <w:p>
-      <w:pPr>
-        <w:shd w:val="clear" w:color="auto" w:fill="FFFFFF"/>
-        <w:spacing w:line="249" w:lineRule="auto"/>
-        <w:rPr>
-          <w:sz w:val="24"/>
-          <w:szCs w:val="24"/>
-        </w:rPr>
-      </w:pPr>
-      <w:hyperlink r:id="rId8">
-        <w:r>
-          <w:rPr>
-            <w:color w:val="1155CC"/>
-            <w:sz w:val="24"/>
-            <w:szCs w:val="24"/>
-            <w:u w:val="single"/>
-          </w:rPr>
-          <w:t>https://canvas.artofdrawers.com/scripts/lms/</w:t>
-        </w:r>
-      </w:hyperlink>
-    </w:p>
-    <w:p>
-      <w:pPr>
-        <w:shd w:val="clear" w:color="auto" w:fill="FFFFFF"/>
-        <w:spacing w:line="249" w:lineRule="auto"/>
-        <w:rPr>
-          <w:sz w:val="24"/>
-          <w:szCs w:val="24"/>
-        </w:rPr>
-      </w:pPr>
-      <w:hyperlink r:id="rId9">
-        <w:r>
-          <w:rPr>
-            <w:color w:val="1155CC"/>
-            <w:sz w:val="24"/>
-            <w:szCs w:val="24"/>
-            <w:u w:val="single"/>
-          </w:rPr>
-          <w:t>https://canvas.artofdrawers.com/help/</w:t>
-        </w:r>
-      </w:hyperlink>
-    </w:p>
-    <w:p>
-      <w:pPr>
-        <w:shd w:val="clear" w:color="auto" w:fill="FFFFFF"/>
-        <w:spacing w:line="249" w:lineRule="auto"/>
-        <w:rPr>
-          <w:sz w:val="24"/>
-          <w:szCs w:val="24"/>
-        </w:rPr>
-      </w:pPr>
-      <w:r>
-        <w:rPr>
-          <w:sz w:val="24"/>
-          <w:szCs w:val="24"/>
-        </w:rPr>
-        <w:t xml:space="preserve">All training information provided during Installer Training is available under the “Training” tab on Canvas. </w:t>
-      </w:r>
-    </w:p>
-    <w:p>
-      <w:pPr>
-        <w:shd w:val="clear" w:color="auto" w:fill="FFFFFF"/>
-        <w:spacing w:line="249" w:lineRule="auto"/>
-        <w:rPr>
-          <w:sz w:val="24"/>
-          <w:szCs w:val="24"/>
-        </w:rPr>
-      </w:pPr>
-      <w:r>
-        <w:rPr>
-          <w:sz w:val="24"/>
-          <w:szCs w:val="24"/>
-        </w:rPr>
-        <w:t>Canvas and Palette guides are on the “Canvas Help” page, which can be accessed in the top right corner of Canvas at any time.</w:t>
-      </w:r>
-    </w:p>
-    <w:p>
-      <w:pPr>
-        <w:shd w:val="clear" w:color="auto" w:fill="FFFFFF"/>
-        <w:spacing w:line="249" w:lineRule="auto"/>
-        <w:rPr>
-          <w:sz w:val="24"/>
-          <w:szCs w:val="24"/>
-        </w:rPr>
-      </w:pPr>
-    </w:p>
-    <w:p>
-      <w:pPr>
-        <w:shd w:val="clear" w:color="auto" w:fill="FFFFFF"/>
-        <w:spacing w:line="249" w:lineRule="auto"/>
-        <w:rPr>
-          <w:b/>
-          <w:sz w:val="24"/>
-          <w:szCs w:val="24"/>
-        </w:rPr>
-      </w:pPr>
-      <w:r>
-        <w:rPr>
-          <w:b/>
-          <w:sz w:val="24"/>
-          <w:szCs w:val="24"/>
-        </w:rPr>
-        <w:t>Art of Drawers Photo Google Drive</w:t>
-      </w:r>
-    </w:p>
-    <w:p>
-      <w:pPr>
-        <w:shd w:val="clear" w:color="auto" w:fill="FFFFFF"/>
-        <w:spacing w:line="249" w:lineRule="auto"/>
-        <w:rPr>
-          <w:sz w:val="24"/>
-          <w:szCs w:val="24"/>
-        </w:rPr>
-      </w:pPr>
-      <w:hyperlink r:id="rId10">
-        <w:r>
-          <w:rPr>
-            <w:color w:val="1155CC"/>
-            <w:sz w:val="24"/>
-            <w:szCs w:val="24"/>
-            <w:u w:val="single"/>
-          </w:rPr>
-          <w:t>https://drive.google.com/drive/u/0/folders/0ADy5QUfzvNf5Uk9PVA</w:t>
-        </w:r>
-      </w:hyperlink>
-    </w:p>
-    <w:p>
-      <w:pPr>
-        <w:shd w:val="clear" w:color="auto" w:fill="FFFFFF"/>
-        <w:spacing w:line="249" w:lineRule="auto"/>
-        <w:rPr>
-          <w:sz w:val="24"/>
-          <w:szCs w:val="24"/>
-        </w:rPr>
-      </w:pPr>
-      <w:r>
-        <w:rPr>
-          <w:sz w:val="24"/>
-          <w:szCs w:val="24"/>
-        </w:rPr>
-        <w:t xml:space="preserve">Access is allowed </w:t>
-      </w:r>
-      <w:r>
-        <w:rPr>
-          <w:b/>
-          <w:sz w:val="24"/>
-          <w:szCs w:val="24"/>
-        </w:rPr>
-        <w:t xml:space="preserve">only </w:t>
-      </w:r>
-      <w:r>
-        <w:rPr>
-          <w:sz w:val="24"/>
-          <w:szCs w:val="24"/>
-        </w:rPr>
-        <w:t>to your Art of Drawers email account. Access will not be granted to personal email accounts.</w:t>
-      </w:r>
-    </w:p>
-    <w:p>
-      <w:pPr>
-        <w:shd w:val="clear" w:color="auto" w:fill="FFFFFF"/>
-        <w:spacing w:line="249" w:lineRule="auto"/>
-        <w:ind w:left="10"/>
-        <w:rPr>
-          <w:sz w:val="24"/>
-          <w:szCs w:val="24"/>
-        </w:rPr>
-      </w:pPr>
-    </w:p>
-    <w:p>
-      <w:pPr>
-        <w:shd w:val="clear" w:color="auto" w:fill="FFFFFF"/>
-        <w:spacing w:line="249" w:lineRule="auto"/>
-        <w:ind w:left="10"/>
-        <w:rPr>
-          <w:b/>
-          <w:sz w:val="24"/>
-          <w:szCs w:val="24"/>
-        </w:rPr>
-      </w:pPr>
-      <w:r>
-        <w:rPr>
-          <w:b/>
-          <w:sz w:val="24"/>
-          <w:szCs w:val="24"/>
-        </w:rPr>
-        <w:t>Systems Setup</w:t>
-      </w:r>
-    </w:p>
-    <w:p>
-      <w:pPr>
-        <w:shd w:val="clear" w:color="auto" w:fill="FFFFFF"/>
-        <w:spacing w:line="249" w:lineRule="auto"/>
-        <w:ind w:left="10"/>
-        <w:rPr>
-          <w:sz w:val="24"/>
-          <w:szCs w:val="24"/>
-        </w:rPr>
-      </w:pPr>
-      <w:hyperlink r:id="rId11">
-        <w:r>
-          <w:rPr>
-            <w:b/>
-            <w:color w:val="1155CC"/>
-            <w:sz w:val="24"/>
-            <w:szCs w:val="24"/>
-            <w:u w:val="single"/>
-          </w:rPr>
-          <w:t>Here</w:t>
-        </w:r>
-      </w:hyperlink>
-      <w:r>
-        <w:rPr>
-          <w:sz w:val="24"/>
-          <w:szCs w:val="24"/>
-        </w:rPr>
-        <w:t xml:space="preserve"> is a video with instructions to get into the Art of Drawers systems with the information from the initial onboarding email. Please have your systems set up prior to arriving for Installer Training. An email with the installer training itinerary and instructions will be sent one week before training.</w:t>
-      </w:r>
-    </w:p>
-    <w:p>
-      <w:pPr>
-        <w:shd w:val="clear" w:color="auto" w:fill="FFFFFF"/>
-        <w:spacing w:line="249" w:lineRule="auto"/>
-        <w:ind w:left="10"/>
-        <w:rPr>
-          <w:sz w:val="24"/>
-          <w:szCs w:val="24"/>
-        </w:rPr>
-      </w:pPr>
-    </w:p>
-    <w:p>
-      <w:pPr>
-        <w:shd w:val="clear" w:color="auto" w:fill="FFFFFF"/>
-        <w:spacing w:line="249" w:lineRule="auto"/>
-        <w:rPr>
-          <w:color w:val="FF0000"/>
-          <w:sz w:val="24"/>
-          <w:szCs w:val="24"/>
-        </w:rPr>
-      </w:pPr>
-      <w:r>
-        <w:rPr>
-          <w:sz w:val="24"/>
-          <w:szCs w:val="24"/>
-        </w:rPr>
-        <w:t xml:space="preserve">Contact </w:t>
-      </w:r>
-      <w:hyperlink r:id="rId12">
-        <w:r>
-          <w:rPr>
-            <w:color w:val="1155CC"/>
-            <w:sz w:val="24"/>
-            <w:szCs w:val="24"/>
-            <w:u w:val="single"/>
-          </w:rPr>
-          <w:t>onboarding@artofdrawers.com</w:t>
-        </w:r>
-      </w:hyperlink>
-      <w:r>
-        <w:rPr>
-          <w:sz w:val="24"/>
-          <w:szCs w:val="24"/>
-        </w:rPr>
-        <w:t xml:space="preserve"> for </w:t>
-      </w:r>
-      <w:r>
-        <w:rPr>
-          <w:sz w:val="24"/>
-          <w:szCs w:val="24"/>
-        </w:rPr>
-        <w:t>password reset</w:t>
-      </w:r>
-      <w:r>
-        <w:rPr>
-          <w:sz w:val="24"/>
-          <w:szCs w:val="24"/>
-        </w:rPr>
-        <w:t xml:space="preserve"> assistance.</w:t>
+        <w:t xml:space="preserve"> allowed with your Art of Drawers email.</w:t>
+      </w:r>
+    </w:p>
+    <w:p>
+      <w:pPr>
+        <w:pStyle w:val="AODHeading"/>
+      </w:pPr>
+      <w:r>
+        <w:t>Need Help?</w:t>
+      </w:r>
+    </w:p>
+    <w:p>
+      <w:pPr>
+        <w:pStyle w:val="AODBody"/>
+      </w:pPr>
+      <w:r>
+        <w:t>Contact onboarding@artofdrawers.com for password reset or onboarding assistance.</w:t>
       </w:r>
     </w:p>
     <w:sectPr>
-      <w:headerReference w:type="default" r:id="rId13"/>
-      <w:footerReference w:type="default" r:id="rId14"/>
+      <w:headerReference w:type="default" r:id="rId8"/>
+      <w:footerReference w:type="default" r:id="rId9"/>
       <w:pgSz w:w="12240" w:h="15840"/>
       <w:pgMar w:top="1440" w:right="1440" w:bottom="1440" w:left="1440" w:header="720" w:footer="720" w:gutter="0"/>
       <w:pgNumType w:start="1"/>
@@ -813,6 +491,192 @@
     </w:r>
   </w:p>
 </w:hdr>
+</file>
+
+<file path=word/numbering.xml><?xml version="1.0" encoding="utf-8"?>
+<w:numbering xmlns:wpc="http://schemas.microsoft.com/office/word/2010/wordprocessingCanvas" xmlns:cx="http://schemas.microsoft.com/office/drawing/2014/chartex" xmlns:cx1="http://schemas.microsoft.com/office/drawing/2015/9/8/chartex" xmlns:cx2="http://schemas.microsoft.com/office/drawing/2015/10/21/chartex" xmlns:cx3="http://schemas.microsoft.com/office/drawing/2016/5/9/chartex" xmlns:cx4="http://schemas.microsoft.com/office/drawing/2016/5/10/chartex" xmlns:cx5="http://schemas.microsoft.com/office/drawing/2016/5/11/chartex" xmlns:cx6="http://schemas.microsoft.com/office/drawing/2016/5/12/chartex" xmlns:cx7="http://schemas.microsoft.com/office/drawing/2016/5/13/chartex" xmlns:cx8="http://schemas.microsoft.com/office/drawing/2016/5/14/chartex" xmlns:mc="http://schemas.openxmlformats.org/markup-compatibility/2006" xmlns:aink="http://schemas.microsoft.com/office/drawing/2016/ink" xmlns:am3d="http://schemas.microsoft.com/office/drawing/2017/model3d" xmlns:o="urn:schemas-microsoft-com:office:office" xmlns:oel="http://schemas.microsoft.com/office/2019/extlst" xmlns:r="http://schemas.openxmlformats.org/officeDocument/2006/relationships" xmlns:m="http://schemas.openxmlformats.org/officeDocument/2006/math" xmlns:v="urn:schemas-microsoft-com:vml" xmlns:wp14="http://schemas.microsoft.com/office/word/2010/wordprocessingDrawing" xmlns:wp="http://schemas.openxmlformats.org/drawingml/2006/wordprocessingDrawing" xmlns:w10="urn:schemas-microsoft-com:office:word" xmlns:w="http://schemas.openxmlformats.org/wordprocessingml/2006/main" xmlns:w14="http://schemas.microsoft.com/office/word/2010/wordml" xmlns:w15="http://schemas.microsoft.com/office/word/2012/wordml" xmlns:w16cex="http://schemas.microsoft.com/office/word/2018/wordml/cex" xmlns:w16cid="http://schemas.microsoft.com/office/word/2016/wordml/cid" xmlns:w16="http://schemas.microsoft.com/office/word/2018/wordml" xmlns:w16du="http://schemas.microsoft.com/office/word/2023/wordml/word16du" xmlns:w16sdtdh="http://schemas.microsoft.com/office/word/2020/wordml/sdtdatahash" xmlns:w16sdtfl="http://schemas.microsoft.com/office/word/2024/wordml/sdtformatlock" xmlns:w16se="http://schemas.microsoft.com/office/word/2015/wordml/symex" xmlns:wpg="http://schemas.microsoft.com/office/word/2010/wordprocessingGroup" xmlns:wpi="http://schemas.microsoft.com/office/word/2010/wordprocessingInk" xmlns:wne="http://schemas.microsoft.com/office/word/2006/wordml" xmlns:wps="http://schemas.microsoft.com/office/word/2010/wordprocessingShape" mc:Ignorable="w14 w15 w16se w16cid w16 w16cex w16sdtdh w16sdtfl w16du wp14">
+  <w:abstractNum w:abstractNumId="0" w15:restartNumberingAfterBreak="0">
+    <w:nsid w:val="25D34976"/>
+    <w:multiLevelType w:val="hybridMultilevel"/>
+    <w:tmpl w:val="9CF26B28"/>
+    <w:lvl w:ilvl="0" w:tplc="0409000F">
+      <w:start w:val="1"/>
+      <w:numFmt w:val="decimal"/>
+      <w:lvlText w:val="%1."/>
+      <w:lvlJc w:val="left"/>
+      <w:pPr>
+        <w:ind w:left="720" w:hanging="360"/>
+      </w:pPr>
+      <w:rPr>
+        <w:rFonts w:hint="default"/>
+      </w:rPr>
+    </w:lvl>
+    <w:lvl w:ilvl="1" w:tplc="04090019" w:tentative="1">
+      <w:start w:val="1"/>
+      <w:numFmt w:val="lowerLetter"/>
+      <w:lvlText w:val="%2."/>
+      <w:lvlJc w:val="left"/>
+      <w:pPr>
+        <w:ind w:left="1440" w:hanging="360"/>
+      </w:pPr>
+    </w:lvl>
+    <w:lvl w:ilvl="2" w:tplc="0409001B" w:tentative="1">
+      <w:start w:val="1"/>
+      <w:numFmt w:val="lowerRoman"/>
+      <w:lvlText w:val="%3."/>
+      <w:lvlJc w:val="right"/>
+      <w:pPr>
+        <w:ind w:left="2160" w:hanging="180"/>
+      </w:pPr>
+    </w:lvl>
+    <w:lvl w:ilvl="3" w:tplc="0409000F" w:tentative="1">
+      <w:start w:val="1"/>
+      <w:numFmt w:val="decimal"/>
+      <w:lvlText w:val="%4."/>
+      <w:lvlJc w:val="left"/>
+      <w:pPr>
+        <w:ind w:left="2880" w:hanging="360"/>
+      </w:pPr>
+    </w:lvl>
+    <w:lvl w:ilvl="4" w:tplc="04090019" w:tentative="1">
+      <w:start w:val="1"/>
+      <w:numFmt w:val="lowerLetter"/>
+      <w:lvlText w:val="%5."/>
+      <w:lvlJc w:val="left"/>
+      <w:pPr>
+        <w:ind w:left="3600" w:hanging="360"/>
+      </w:pPr>
+    </w:lvl>
+    <w:lvl w:ilvl="5" w:tplc="0409001B" w:tentative="1">
+      <w:start w:val="1"/>
+      <w:numFmt w:val="lowerRoman"/>
+      <w:lvlText w:val="%6."/>
+      <w:lvlJc w:val="right"/>
+      <w:pPr>
+        <w:ind w:left="4320" w:hanging="180"/>
+      </w:pPr>
+    </w:lvl>
+    <w:lvl w:ilvl="6" w:tplc="0409000F" w:tentative="1">
+      <w:start w:val="1"/>
+      <w:numFmt w:val="decimal"/>
+      <w:lvlText w:val="%7."/>
+      <w:lvlJc w:val="left"/>
+      <w:pPr>
+        <w:ind w:left="5040" w:hanging="360"/>
+      </w:pPr>
+    </w:lvl>
+    <w:lvl w:ilvl="7" w:tplc="04090019" w:tentative="1">
+      <w:start w:val="1"/>
+      <w:numFmt w:val="lowerLetter"/>
+      <w:lvlText w:val="%8."/>
+      <w:lvlJc w:val="left"/>
+      <w:pPr>
+        <w:ind w:left="5760" w:hanging="360"/>
+      </w:pPr>
+    </w:lvl>
+    <w:lvl w:ilvl="8" w:tplc="0409001B" w:tentative="1">
+      <w:start w:val="1"/>
+      <w:numFmt w:val="lowerRoman"/>
+      <w:lvlText w:val="%9."/>
+      <w:lvlJc w:val="right"/>
+      <w:pPr>
+        <w:ind w:left="6480" w:hanging="180"/>
+      </w:pPr>
+    </w:lvl>
+  </w:abstractNum>
+  <w:abstractNum w:abstractNumId="1" w15:restartNumberingAfterBreak="0">
+    <w:nsid w:val="3F822BD8"/>
+    <w:multiLevelType w:val="hybridMultilevel"/>
+    <w:tmpl w:val="639CCE46"/>
+    <w:lvl w:ilvl="0" w:tplc="0409000F">
+      <w:start w:val="1"/>
+      <w:numFmt w:val="decimal"/>
+      <w:lvlText w:val="%1."/>
+      <w:lvlJc w:val="left"/>
+      <w:pPr>
+        <w:ind w:left="360" w:hanging="360"/>
+      </w:pPr>
+    </w:lvl>
+    <w:lvl w:ilvl="1" w:tplc="04090019" w:tentative="1">
+      <w:start w:val="1"/>
+      <w:numFmt w:val="lowerLetter"/>
+      <w:lvlText w:val="%2."/>
+      <w:lvlJc w:val="left"/>
+      <w:pPr>
+        <w:ind w:left="1080" w:hanging="360"/>
+      </w:pPr>
+    </w:lvl>
+    <w:lvl w:ilvl="2" w:tplc="0409001B" w:tentative="1">
+      <w:start w:val="1"/>
+      <w:numFmt w:val="lowerRoman"/>
+      <w:lvlText w:val="%3."/>
+      <w:lvlJc w:val="right"/>
+      <w:pPr>
+        <w:ind w:left="1800" w:hanging="180"/>
+      </w:pPr>
+    </w:lvl>
+    <w:lvl w:ilvl="3" w:tplc="0409000F" w:tentative="1">
+      <w:start w:val="1"/>
+      <w:numFmt w:val="decimal"/>
+      <w:lvlText w:val="%4."/>
+      <w:lvlJc w:val="left"/>
+      <w:pPr>
+        <w:ind w:left="2520" w:hanging="360"/>
+      </w:pPr>
+    </w:lvl>
+    <w:lvl w:ilvl="4" w:tplc="04090019" w:tentative="1">
+      <w:start w:val="1"/>
+      <w:numFmt w:val="lowerLetter"/>
+      <w:lvlText w:val="%5."/>
+      <w:lvlJc w:val="left"/>
+      <w:pPr>
+        <w:ind w:left="3240" w:hanging="360"/>
+      </w:pPr>
+    </w:lvl>
+    <w:lvl w:ilvl="5" w:tplc="0409001B" w:tentative="1">
+      <w:start w:val="1"/>
+      <w:numFmt w:val="lowerRoman"/>
+      <w:lvlText w:val="%6."/>
+      <w:lvlJc w:val="right"/>
+      <w:pPr>
+        <w:ind w:left="3960" w:hanging="180"/>
+      </w:pPr>
+    </w:lvl>
+    <w:lvl w:ilvl="6" w:tplc="0409000F" w:tentative="1">
+      <w:start w:val="1"/>
+      <w:numFmt w:val="decimal"/>
+      <w:lvlText w:val="%7."/>
+      <w:lvlJc w:val="left"/>
+      <w:pPr>
+        <w:ind w:left="4680" w:hanging="360"/>
+      </w:pPr>
+    </w:lvl>
+    <w:lvl w:ilvl="7" w:tplc="04090019" w:tentative="1">
+      <w:start w:val="1"/>
+      <w:numFmt w:val="lowerLetter"/>
+      <w:lvlText w:val="%8."/>
+      <w:lvlJc w:val="left"/>
+      <w:pPr>
+        <w:ind w:left="5400" w:hanging="360"/>
+      </w:pPr>
+    </w:lvl>
+    <w:lvl w:ilvl="8" w:tplc="0409001B" w:tentative="1">
+      <w:start w:val="1"/>
+      <w:numFmt w:val="lowerRoman"/>
+      <w:lvlText w:val="%9."/>
+      <w:lvlJc w:val="right"/>
+      <w:pPr>
+        <w:ind w:left="6120" w:hanging="180"/>
+      </w:pPr>
+    </w:lvl>
+  </w:abstractNum>
+  <w:num w:numId="1" w16cid:durableId="1808548349">
+    <w:abstractNumId w:val="1"/>
+  </w:num>
+  <w:num w:numId="2" w16cid:durableId="1738867789">
+    <w:abstractNumId w:val="0"/>
+  </w:num>
+</w:numbering>
 </file>
 
 <file path=word/styles.xml><?xml version="1.0" encoding="utf-8"?>
@@ -1465,6 +1329,55 @@
       <w:shd w:val="clear" w:color="auto" w:fill="E1DFDD"/>
     </w:rPr>
   </w:style>
+  <w:style w:type="paragraph" w:customStyle="1" w:styleId="AODTitle">
+    <w:name w:val="AOD Title"/>
+    <w:rsid w:val="00C06A17"/>
+    <w:pPr>
+      <w:spacing w:after="200"/>
+    </w:pPr>
+    <w:rPr>
+      <w:rFonts w:ascii="Montserrat" w:eastAsia="Montserrat" w:hAnsi="Montserrat" w:cstheme="minorBidi"/>
+      <w:b/>
+      <w:sz w:val="28"/>
+      <w:lang w:val="en-US"/>
+    </w:rPr>
+  </w:style>
+  <w:style w:type="paragraph" w:customStyle="1" w:styleId="AODHeading">
+    <w:name w:val="AOD Heading"/>
+    <w:rsid w:val="00C06A17"/>
+    <w:pPr>
+      <w:spacing w:after="200"/>
+    </w:pPr>
+    <w:rPr>
+      <w:rFonts w:ascii="Montserrat" w:eastAsia="Montserrat" w:hAnsi="Montserrat" w:cstheme="minorBidi"/>
+      <w:b/>
+      <w:lang w:val="en-US"/>
+    </w:rPr>
+  </w:style>
+  <w:style w:type="paragraph" w:customStyle="1" w:styleId="AODBody">
+    <w:name w:val="AOD Body"/>
+    <w:rsid w:val="00C06A17"/>
+    <w:pPr>
+      <w:spacing w:after="200"/>
+    </w:pPr>
+    <w:rPr>
+      <w:rFonts w:ascii="Montserrat" w:eastAsia="Montserrat" w:hAnsi="Montserrat" w:cstheme="minorBidi"/>
+      <w:sz w:val="20"/>
+      <w:lang w:val="en-US"/>
+    </w:rPr>
+  </w:style>
+  <w:style w:type="character" w:styleId="FollowedHyperlink">
+    <w:name w:val="FollowedHyperlink"/>
+    <w:basedOn w:val="DefaultParagraphFont"/>
+    <w:uiPriority w:val="99"/>
+    <w:semiHidden/>
+    <w:unhideWhenUsed/>
+    <w:rsid w:val="00DF30C6"/>
+    <w:rPr>
+      <w:color w:val="800080" w:themeColor="followedHyperlink"/>
+      <w:u w:val="single"/>
+    </w:rPr>
+  </w:style>
 </w:styles>
 </file>
 

</xml_diff>